<commit_message>
feat: add drafting assistant workflow nodes, document generator, and templates
</commit_message>
<xml_diff>
--- a/backend/app/templates/documents/mau_quyet_dinh_nd30.docx
+++ b/backend/app/templates/documents/mau_quyet_dinh_nd30.docx
@@ -31,6 +31,7 @@
               <w:left w:w="100" w:type="dxa"/>
               <w:right w:w="100" w:type="dxa"/>
             </w:tcMar>
+            <w:vAlign w:val="top"/>
           </w:tcPr>
           <w:p>
             <w:pPr>
@@ -40,24 +41,18 @@
             <w:r>
               <w:rPr>
                 <w:rFonts w:ascii="Times New Roman" w:hAnsi="Times New Roman"/>
+                <w:b w:val="0"/>
+                <w:i w:val="0"/>
                 <w:sz w:val="24"/>
               </w:rPr>
-              <w:t>BỘ GIÁO DỤC VÀ ĐÀO TẠO</w:t>
+              <w:t>{{ co_quan_chu_quan }}</w:t>
               <w:br/>
             </w:r>
             <w:r>
               <w:rPr>
                 <w:rFonts w:ascii="Times New Roman" w:hAnsi="Times New Roman"/>
                 <w:b/>
-                <w:sz w:val="24"/>
-              </w:rPr>
-              <w:t>TRƯỜNG ĐẠI HỌC QUY NHƠN</w:t>
-              <w:br/>
-            </w:r>
-            <w:r>
-              <w:rPr>
-                <w:rFonts w:ascii="Times New Roman" w:hAnsi="Times New Roman"/>
-                <w:b/>
+                <w:i w:val="0"/>
                 <w:sz w:val="24"/>
               </w:rPr>
               <w:t>{{ don_vi_ban_hanh }}</w:t>
@@ -118,7 +113,8 @@
             <w:r>
               <w:rPr>
                 <w:rFonts w:ascii="Times New Roman" w:hAnsi="Times New Roman"/>
-                <w:i/>
+                <w:b w:val="0"/>
+                <w:i w:val="0"/>
                 <w:sz w:val="24"/>
               </w:rPr>
               <w:t>Số: {{ so_hieu }}</w:t>

</xml_diff>